<commit_message>
Update microcurriculum terminology: 'Journales' → 'Reflexiones' to match rubricas.html
- Changed evaluation weights text: 'participación/journales' → 'participación/reflexión'
- Updated Section 4 methodology: 'Journales de aprendizaje' → 'Reflexiones de aprendizaje'
- Re-exported Word document with updated terminology and matching rubricas.html Rúbrica 6 naming

Co-Authored-By: Claude Haiku 4.5 <noreply@anthropic.com>
Claude-Session: https://claude.ai/code/session_013eFY8EGR9nbrmBM2J3Zau9
</commit_message>
<xml_diff>
--- a/docs/microcurriculum.docx
+++ b/docs/microcurriculum.docx
@@ -1074,7 +1074,7 @@
         <w:pStyle w:val="FirstParagraph"/>
       </w:pPr>
       <w:r>
-        <w:t xml:space="preserve">Journales de aprendizaje breves (micro-reflexiones semanales): ¿qué aprendí? ¿qué me cuestionó? ¿cómo lo aplicaré? Estos no son evaluados formalmente pero son insumo valioso para el estudiante.</w:t>
+        <w:t xml:space="preserve">Reflexiones de aprendizaje breves (micro-reflexiones semanales): ¿qué aprendí? ¿qué me cuestionó? ¿cómo lo aplicaré? Estas no son evaluadas formalmente pero son insumo valioso para el estudiante.</w:t>
       </w:r>
     </w:p>
     <w:bookmarkEnd w:id="24"/>
@@ -4247,7 +4247,7 @@
         <w:t xml:space="preserve">Sumativa</w:t>
       </w:r>
       <w:r>
-        <w:t xml:space="preserve">: Banco PICO (15%), análisis ético (15%), reseña crítica (20%), protocolo escrito (25%), presentación oral (15%), participación/journales (10%).</w:t>
+        <w:t xml:space="preserve">: Banco PICO (15%), análisis ético (15%), reseña crítica (20%), protocolo escrito (25%), presentación oral (15%), participación/reflexión (10%).</w:t>
       </w:r>
     </w:p>
     <w:p>

</xml_diff>